<commit_message>
render word ya funciona, aunque el índice sale mal
</commit_message>
<xml_diff>
--- a/docx/reference.docx
+++ b/docx/reference.docx
@@ -1,6 +1,6 @@
 
 <file path=word/document.xml><?xml version="1.0" encoding="utf-8"?>
-<w:document xmlns:r="http://schemas.openxmlformats.org/officeDocument/2006/relationships" xmlns:w="http://schemas.openxmlformats.org/wordprocessingml/2006/main">
+<w:document xmlns:w="http://schemas.openxmlformats.org/wordprocessingml/2006/main" xmlns:m="http://schemas.openxmlformats.org/officeDocument/2006/math" xmlns:r="http://schemas.openxmlformats.org/officeDocument/2006/relationships" xmlns:o="urn:schemas-microsoft-com:office:office" xmlns:v="urn:schemas-microsoft-com:vml" xmlns:w10="urn:schemas-microsoft-com:office:word" xmlns:a="http://schemas.openxmlformats.org/drawingml/2006/main" xmlns:pic="http://schemas.openxmlformats.org/drawingml/2006/picture" xmlns:wp="http://schemas.openxmlformats.org/drawingml/2006/wordprocessingDrawing">
   <w:body>
     <w:p>
       <w:pPr>
@@ -317,8 +317,6 @@
       <w:footnotePr>
         <w:numRestart w:val="eachSect"/>
       </w:footnotePr>
-      <w:footerReference w:type="default" r:id="rId31"/>
-      <w:pgNumType w:start="1"/>
     </w:sectPr>
   </w:body>
 </w:document>
@@ -326,31 +324,6 @@
 
 <file path=word/comments.xml><?xml version="1.0" encoding="utf-8"?>
 <w:comments xmlns:w="http://schemas.openxmlformats.org/wordprocessingml/2006/main" xmlns:m="http://schemas.openxmlformats.org/officeDocument/2006/math" xmlns:r="http://schemas.openxmlformats.org/officeDocument/2006/relationships" xmlns:o="urn:schemas-microsoft-com:office:office" xmlns:v="urn:schemas-microsoft-com:vml" xmlns:w10="urn:schemas-microsoft-com:office:word" xmlns:a="http://schemas.openxmlformats.org/drawingml/2006/main" xmlns:pic="http://schemas.openxmlformats.org/drawingml/2006/picture" xmlns:wp="http://schemas.openxmlformats.org/drawingml/2006/wordprocessingDrawing"/>
-</file>
-
-<file path=word/footer1.xml><?xml version="1.0" encoding="utf-8"?>
-<w:ftr xmlns:w="http://schemas.openxmlformats.org/wordprocessingml/2006/main">
-  <w:p>
-    <w:pPr>
-      <w:jc w:val="center"/>
-    </w:pPr>
-    <w:r>
-      <w:fldChar w:fldCharType="begin"/>
-    </w:r>
-    <w:r>
-      <w:instrText xml:space="preserve"> PAGE </w:instrText>
-    </w:r>
-    <w:r>
-      <w:fldChar w:fldCharType="separate"/>
-    </w:r>
-    <w:r>
-      <w:t>1</w:t>
-    </w:r>
-    <w:r>
-      <w:fldChar w:fldCharType="end"/>
-    </w:r>
-  </w:p>
-</w:ftr>
 </file>
 
 <file path=word/footnotes.xml><?xml version="1.0" encoding="utf-8"?>
@@ -508,14 +481,14 @@
 </file>
 
 <file path=word/styles.xml><?xml version="1.0" encoding="utf-8"?>
-<w:styles xmlns:w="http://schemas.openxmlformats.org/wordprocessingml/2006/main">
+<w:styles xmlns:r="http://schemas.openxmlformats.org/officeDocument/2006/relationships" xmlns:w="http://schemas.openxmlformats.org/wordprocessingml/2006/main">
   <w:docDefaults>
     <w:rPrDefault>
       <w:rPr>
         <w:rFonts w:asciiTheme="minorHAnsi" w:eastAsiaTheme="minorEastAsia" w:hAnsiTheme="minorHAnsi" w:cstheme="minorBidi"/>
         <w:sz w:val="24"/>
         <w:szCs w:val="24"/>
-        <w:lang w:val="es-PE" w:eastAsia="es-PE" w:bidi="es-PE"/>
+        <w:lang w:val="en-US" w:eastAsia="zh-CN" w:bidi="ar-SA"/>
       </w:rPr>
     </w:rPrDefault>
     <w:pPrDefault>
@@ -528,10 +501,6 @@
   <w:style w:type="paragraph" w:default="1" w:styleId="Normal">
     <w:name w:val="Normal"/>
     <w:qFormat/>
-    <w:pPr>
-      <w:jc w:val="both"/>
-      <w:spacing w:after="60" w:line="276" w:lineRule="auto"/>
-    </w:pPr>
   </w:style>
   <w:style w:type="paragraph" w:styleId="BodyText">
     <w:name w:val="Body Text"/>
@@ -539,8 +508,7 @@
     <w:link w:val="BodyTextChar"/>
     <w:qFormat/>
     <w:pPr>
-      <w:spacing w:before="180" w:after="60" w:line="276" w:lineRule="auto"/>
-      <w:jc w:val="both"/>
+      <w:spacing w:before="180" w:after="180"/>
     </w:pPr>
   </w:style>
   <w:style w:type="paragraph" w:customStyle="1" w:styleId="FirstParagraph">
@@ -548,18 +516,13 @@
     <w:basedOn w:val="BodyText"/>
     <w:next w:val="BodyText"/>
     <w:qFormat/>
-    <w:pPr>
-      <w:jc w:val="both"/>
-      <w:spacing w:after="60" w:line="276" w:lineRule="auto"/>
-    </w:pPr>
   </w:style>
   <w:style w:type="paragraph" w:customStyle="1" w:styleId="Compact">
     <w:name w:val="Compact"/>
     <w:basedOn w:val="BodyText"/>
     <w:qFormat/>
     <w:pPr>
-      <w:spacing w:before="36" w:after="0" w:line="240" w:lineRule="auto"/>
-      <w:jc w:val="left"/>
+      <w:spacing w:before="36" w:after="36"/>
     </w:pPr>
   </w:style>
   <w:style w:type="paragraph" w:styleId="Title">
@@ -592,10 +555,6 @@
       <w:sz w:val="56"/>
       <w:szCs w:val="56"/>
     </w:rPr>
-    <w:pPr>
-      <w:spacing/>
-      <w:jc/>
-    </w:pPr>
   </w:style>
   <w:style w:type="paragraph" w:styleId="Subtitle">
     <w:name w:val="Subtitle"/>
@@ -609,8 +568,6 @@
       <w:numPr>
         <w:ilvl w:val="1"/>
       </w:numPr>
-      <w:spacing/>
-      <w:jc/>
     </w:pPr>
     <w:rPr>
       <w:rFonts w:eastAsiaTheme="majorEastAsia" w:cstheme="majorBidi"/>
@@ -632,10 +589,6 @@
       <w:sz w:val="28"/>
       <w:szCs w:val="28"/>
     </w:rPr>
-    <w:pPr>
-      <w:spacing/>
-      <w:jc/>
-    </w:pPr>
   </w:style>
   <w:style w:type="paragraph" w:customStyle="1" w:styleId="Author">
     <w:name w:val="Author"/>
@@ -645,8 +598,6 @@
     <w:pPr>
       <w:keepNext/>
       <w:keepLines/>
-      <w:spacing/>
-      <w:jc/>
     </w:pPr>
     <w:rPr>
       <w:sz w:val="24"/>
@@ -661,8 +612,6 @@
     <w:pPr>
       <w:keepNext/>
       <w:keepLines/>
-      <w:spacing/>
-      <w:jc/>
     </w:pPr>
     <w:rPr>
       <w:sz w:val="24"/>
@@ -695,7 +644,6 @@
       <w:keepNext/>
       <w:keepLines/>
       <w:spacing w:before="100" w:after="300"/>
-      <w:jc/>
     </w:pPr>
     <w:rPr>
       <w:sz w:val="20"/>
@@ -707,10 +655,7 @@
     <w:basedOn w:val="Normal"/>
     <w:next w:val="Bibliography"/>
     <w:qFormat/>
-    <w:pPr>
-      <w:spacing/>
-      <w:jc/>
-    </w:pPr>
+    <w:pPr/>
     <w:rPr/>
   </w:style>
   <w:style w:type="paragraph" w:styleId="Heading1">
@@ -724,9 +669,8 @@
     <w:pPr>
       <w:keepNext/>
       <w:keepLines/>
-      <w:spacing w:before="120" w:after="80"/>
+      <w:spacing w:before="360" w:after="80"/>
       <w:outlineLvl w:val="0"/>
-      <w:jc w:val="left"/>
     </w:pPr>
     <w:rPr>
       <w:rFonts w:asciiTheme="majorHAnsi" w:eastAsiaTheme="majorEastAsia" w:hAnsiTheme="majorHAnsi" w:cstheme="majorBidi"/>
@@ -748,9 +692,8 @@
     <w:pPr>
       <w:keepNext/>
       <w:keepLines/>
-      <w:spacing w:before="120" w:after="80"/>
+      <w:spacing w:before="160" w:after="80"/>
       <w:outlineLvl w:val="1"/>
-      <w:jc w:val="left"/>
     </w:pPr>
     <w:rPr>
       <w:rFonts w:asciiTheme="majorHAnsi" w:eastAsiaTheme="majorEastAsia" w:hAnsiTheme="majorHAnsi" w:cstheme="majorBidi"/>
@@ -772,9 +715,8 @@
     <w:pPr>
       <w:keepNext/>
       <w:keepLines/>
-      <w:spacing w:before="120" w:after="80"/>
+      <w:spacing w:before="160" w:after="80"/>
       <w:outlineLvl w:val="2"/>
-      <w:jc w:val="left"/>
     </w:pPr>
     <w:rPr>
       <w:rFonts w:eastAsiaTheme="majorEastAsia" w:cstheme="majorBidi"/>
@@ -798,7 +740,6 @@
       <w:keepLines/>
       <w:spacing w:before="80" w:after="40"/>
       <w:outlineLvl w:val="3"/>
-      <w:jc/>
     </w:pPr>
     <w:rPr>
       <w:rFonts w:eastAsiaTheme="majorEastAsia" w:cstheme="majorBidi"/>
@@ -822,7 +763,6 @@
       <w:keepLines/>
       <w:spacing w:before="80" w:after="40"/>
       <w:outlineLvl w:val="4"/>
-      <w:jc/>
     </w:pPr>
     <w:rPr>
       <w:rFonts w:eastAsiaTheme="majorEastAsia" w:cstheme="majorBidi"/>
@@ -844,7 +784,6 @@
       <w:keepLines/>
       <w:spacing w:before="40" w:after="0"/>
       <w:outlineLvl w:val="5"/>
-      <w:jc/>
     </w:pPr>
     <w:rPr>
       <w:rFonts w:eastAsiaTheme="majorEastAsia" w:cstheme="majorBidi"/>
@@ -868,7 +807,6 @@
       <w:keepLines/>
       <w:spacing w:before="40" w:after="0"/>
       <w:outlineLvl w:val="6"/>
-      <w:jc/>
     </w:pPr>
     <w:rPr>
       <w:rFonts w:eastAsiaTheme="majorEastAsia" w:cstheme="majorBidi"/>
@@ -890,7 +828,6 @@
       <w:keepLines/>
       <w:spacing w:after="0"/>
       <w:outlineLvl w:val="7"/>
-      <w:jc/>
     </w:pPr>
     <w:rPr>
       <w:rFonts w:eastAsiaTheme="majorEastAsia" w:cstheme="majorBidi"/>
@@ -914,7 +851,6 @@
       <w:keepLines/>
       <w:spacing w:after="0"/>
       <w:outlineLvl w:val="8"/>
-      <w:jc/>
     </w:pPr>
     <w:rPr>
       <w:rFonts w:eastAsiaTheme="majorEastAsia" w:cstheme="majorBidi"/>
@@ -933,10 +869,6 @@
       <w:sz w:val="40"/>
       <w:szCs w:val="40"/>
     </w:rPr>
-    <w:pPr>
-      <w:spacing/>
-      <w:jc/>
-    </w:pPr>
   </w:style>
   <w:style w:type="character" w:customStyle="1" w:styleId="Heading2Char">
     <w:name w:val="Heading 2 Char"/>
@@ -951,10 +883,6 @@
       <w:sz w:val="32"/>
       <w:szCs w:val="32"/>
     </w:rPr>
-    <w:pPr>
-      <w:spacing/>
-      <w:jc/>
-    </w:pPr>
   </w:style>
   <w:style w:type="character" w:customStyle="1" w:styleId="Heading3Char">
     <w:name w:val="Heading 3 Char"/>
@@ -969,10 +897,6 @@
       <w:sz w:val="28"/>
       <w:szCs w:val="28"/>
     </w:rPr>
-    <w:pPr>
-      <w:spacing/>
-      <w:jc/>
-    </w:pPr>
   </w:style>
   <w:style w:type="character" w:customStyle="1" w:styleId="Heading4Char">
     <w:name w:val="Heading 4 Char"/>
@@ -987,10 +911,6 @@
       <w:iCs/>
       <w:color w:val="0F4761" w:themeColor="accent1" w:themeShade="BF"/>
     </w:rPr>
-    <w:pPr>
-      <w:spacing/>
-      <w:jc/>
-    </w:pPr>
   </w:style>
   <w:style w:type="character" w:customStyle="1" w:styleId="Heading5Char">
     <w:name w:val="Heading 5 Char"/>
@@ -1003,10 +923,6 @@
       <w:rFonts w:eastAsiaTheme="majorEastAsia" w:cstheme="majorBidi"/>
       <w:color w:val="0F4761" w:themeColor="accent1" w:themeShade="BF"/>
     </w:rPr>
-    <w:pPr>
-      <w:spacing/>
-      <w:jc/>
-    </w:pPr>
   </w:style>
   <w:style w:type="character" w:customStyle="1" w:styleId="Heading6Char">
     <w:name w:val="Heading 6 Char"/>
@@ -1021,10 +937,6 @@
       <w:iCs/>
       <w:color w:val="595959" w:themeColor="text1" w:themeTint="A6"/>
     </w:rPr>
-    <w:pPr>
-      <w:spacing/>
-      <w:jc/>
-    </w:pPr>
   </w:style>
   <w:style w:type="character" w:customStyle="1" w:styleId="Heading7Char">
     <w:name w:val="Heading 7 Char"/>
@@ -1037,10 +949,6 @@
       <w:rFonts w:eastAsiaTheme="majorEastAsia" w:cstheme="majorBidi"/>
       <w:color w:val="595959" w:themeColor="text1" w:themeTint="A6"/>
     </w:rPr>
-    <w:pPr>
-      <w:spacing/>
-      <w:jc/>
-    </w:pPr>
   </w:style>
   <w:style w:type="character" w:customStyle="1" w:styleId="Heading8Char">
     <w:name w:val="Heading 8 Char"/>
@@ -1055,10 +963,6 @@
       <w:iCs/>
       <w:color w:val="272727" w:themeColor="text1" w:themeTint="D8"/>
     </w:rPr>
-    <w:pPr>
-      <w:spacing/>
-      <w:jc/>
-    </w:pPr>
   </w:style>
   <w:style w:type="character" w:customStyle="1" w:styleId="Heading9Char">
     <w:name w:val="Heading 9 Char"/>
@@ -1071,10 +975,6 @@
       <w:rFonts w:eastAsiaTheme="majorEastAsia" w:cstheme="majorBidi"/>
       <w:color w:val="272727" w:themeColor="text1" w:themeTint="D8"/>
     </w:rPr>
-    <w:pPr>
-      <w:spacing/>
-      <w:jc/>
-    </w:pPr>
   </w:style>
   <w:style w:type="paragraph" w:styleId="BlockText">
     <w:name w:val="Block Text"/>
@@ -1084,9 +984,8 @@
     <w:unhideWhenUsed/>
     <w:qFormat/>
     <w:pPr>
-      <w:spacing w:before="100" w:after="60" w:line="240" w:lineRule="auto"/>
+      <w:spacing w:before="100" w:after="100"/>
       <w:ind w:firstLine="0" w:left="480" w:right="480"/>
-      <w:jc w:val="left"/>
     </w:pPr>
   </w:style>
   <w:style w:type="paragraph" w:styleId="FootnoteText">
@@ -1096,10 +995,6 @@
     <w:uiPriority w:val="9"/>
     <w:unhideWhenUsed/>
     <w:qFormat/>
-    <w:pPr>
-      <w:spacing/>
-      <w:jc/>
-    </w:pPr>
   </w:style>
   <w:style w:type="paragraph" w:styleId="FootnoteBlockText">
     <w:name w:val="Footnote Block Text"/>
@@ -1111,17 +1006,12 @@
     <w:pPr>
       <w:spacing w:before="100" w:after="100"/>
       <w:ind w:firstLine="0" w:left="480" w:right="480"/>
-      <w:jc/>
     </w:pPr>
   </w:style>
   <w:style w:type="character" w:default="1" w:styleId="DefaultParagraphFont">
     <w:name w:val="Default Paragraph Font"/>
     <w:semiHidden/>
     <w:unhideWhenUsed/>
-    <w:pPr>
-      <w:spacing/>
-      <w:jc/>
-    </w:pPr>
   </w:style>
   <w:style w:type="table" w:default="1" w:styleId="Table">
     <w:name w:val="Table"/>
@@ -1146,10 +1036,6 @@
         <w:vAlign w:val="bottom"/>
       </w:tcPr>
     </w:tblStylePr>
-    <w:pPr>
-      <w:spacing/>
-      <w:jc/>
-    </w:pPr>
   </w:style>
   <w:style w:type="paragraph" w:customStyle="1" w:styleId="DefinitionTerm">
     <w:name w:val="Definition Term"/>
@@ -1159,7 +1045,6 @@
       <w:keepNext/>
       <w:keepLines/>
       <w:spacing w:after="0"/>
-      <w:jc/>
     </w:pPr>
     <w:rPr>
       <w:b/>
@@ -1168,10 +1053,6 @@
   <w:style w:type="paragraph" w:customStyle="1" w:styleId="Definition">
     <w:name w:val="Definition"/>
     <w:basedOn w:val="Normal"/>
-    <w:pPr>
-      <w:spacing/>
-      <w:jc/>
-    </w:pPr>
   </w:style>
   <w:style w:type="paragraph" w:styleId="Caption">
     <w:name w:val="Caption"/>
@@ -1179,7 +1060,6 @@
     <w:link w:val="BodyTextChar"/>
     <w:pPr>
       <w:spacing w:before="0" w:after="120"/>
-      <w:jc/>
     </w:pPr>
     <w:rPr>
       <w:i/>
@@ -1190,43 +1070,27 @@
     <w:basedOn w:val="Caption"/>
     <w:pPr>
       <w:keepNext/>
-      <w:spacing w:after="60" w:line="240" w:lineRule="auto"/>
-      <w:jc w:val="left"/>
     </w:pPr>
   </w:style>
   <w:style w:type="paragraph" w:customStyle="1" w:styleId="ImageCaption">
     <w:name w:val="Image Caption"/>
     <w:basedOn w:val="Caption"/>
-    <w:pPr>
-      <w:spacing w:after="60" w:line="240" w:lineRule="auto"/>
-      <w:jc w:val="left"/>
-    </w:pPr>
   </w:style>
   <w:style w:type="paragraph" w:customStyle="1" w:styleId="Figure">
     <w:name w:val="Figure"/>
     <w:basedOn w:val="Normal"/>
-    <w:pPr>
-      <w:spacing/>
-      <w:jc/>
-    </w:pPr>
   </w:style>
   <w:style w:type="paragraph" w:customStyle="1" w:styleId="CaptionedFigure">
     <w:name w:val="Captioned Figure"/>
     <w:basedOn w:val="Figure"/>
     <w:pPr>
       <w:keepNext/>
-      <w:spacing/>
-      <w:jc/>
     </w:pPr>
   </w:style>
   <w:style w:type="character" w:customStyle="1" w:styleId="BodyTextChar">
     <w:name w:val="Body Text Char"/>
     <w:basedOn w:val="DefaultParagraphFont"/>
     <w:link w:val="BodyText"/>
-    <w:pPr>
-      <w:spacing/>
-      <w:jc/>
-    </w:pPr>
   </w:style>
   <w:style w:type="character" w:customStyle="1" w:styleId="VerbatimChar">
     <w:name w:val="Verbatim Char"/>
@@ -1235,18 +1099,10 @@
       <w:rFonts w:ascii="Consolas" w:hAnsi="Consolas"/>
       <w:sz w:val="22"/>
     </w:rPr>
-    <w:pPr>
-      <w:spacing/>
-      <w:jc/>
-    </w:pPr>
   </w:style>
   <w:style w:type="character" w:customStyle="1" w:styleId="SectionNumber">
     <w:name w:val="Section Number"/>
     <w:basedOn w:val="BodyTextChar"/>
-    <w:pPr>
-      <w:spacing/>
-      <w:jc/>
-    </w:pPr>
   </w:style>
   <w:style w:type="character" w:styleId="FootnoteReference">
     <w:name w:val="Footnote Reference"/>
@@ -1254,10 +1110,6 @@
     <w:rPr>
       <w:vertAlign w:val="superscript"/>
     </w:rPr>
-    <w:pPr>
-      <w:spacing/>
-      <w:jc/>
-    </w:pPr>
   </w:style>
   <w:style w:type="character" w:styleId="Hyperlink">
     <w:name w:val="Hyperlink"/>
@@ -1265,10 +1117,6 @@
     <w:rPr>
       <w:color w:val="4F81BD" w:themeColor="accent1"/>
     </w:rPr>
-    <w:pPr>
-      <w:spacing/>
-      <w:jc/>
-    </w:pPr>
   </w:style>
   <w:style w:type="paragraph" w:styleId="TOCHeading">
     <w:name w:val="TOC Heading"/>
@@ -1280,7 +1128,6 @@
     <w:pPr>
       <w:spacing w:before="240" w:line="259" w:lineRule="auto"/>
       <w:outlineLvl w:val="9"/>
-      <w:jc/>
     </w:pPr>
     <w:rPr>
       <w:rFonts w:asciiTheme="majorHAnsi" w:eastAsiaTheme="majorEastAsia" w:hAnsiTheme="majorHAnsi" w:cstheme="majorBidi"/>

</xml_diff>